<commit_message>
Add final 2-column professional resume for Nimisha Mehta
- New Nimisha-Mehta-2Column-Professional.docx with:
  - 25/75 two-column layout (navy blue sidebar + white content)
  - Circular face-focused professional photo
  - Career Objective, Work Experience with HR dividers
  - HCL: Public Cloud Lead (AWS/Azure) with vRA/vRO automation section
  - HCL: Azure Cloud Lead (Novartis/Sandoz Pharma)
  - Tech Mahindra: Azure Cloud Manager & L1/L2 Engineer
  - Key Achievements section
- Updated ATS resume with photo

Co-authored-by: Copilot App <223556219+Copilot@users.noreply.github.com>
</commit_message>
<xml_diff>
--- a/Nimisha-Mehta-ATS-Resume-Visual.docx
+++ b/Nimisha-Mehta-ATS-Resume-Visual.docx
@@ -2,6 +2,45 @@
 <file path=word/document.xml><?xml version="1.0" encoding="utf-8"?>
 <w:document xmlns:wpc="http://schemas.microsoft.com/office/word/2010/wordprocessingCanvas" xmlns:mo="http://schemas.microsoft.com/office/mac/office/2008/main" xmlns:mc="http://schemas.openxmlformats.org/markup-compatibility/2006" xmlns:mv="urn:schemas-microsoft-com:mac:vml" xmlns:o="urn:schemas-microsoft-com:office:office" xmlns:r="http://schemas.openxmlformats.org/officeDocument/2006/relationships" xmlns:m="http://schemas.openxmlformats.org/officeDocument/2006/math" xmlns:v="urn:schemas-microsoft-com:vml" xmlns:wp14="http://schemas.microsoft.com/office/word/2010/wordprocessingDrawing" xmlns:wp="http://schemas.openxmlformats.org/drawingml/2006/wordprocessingDrawing" xmlns:w10="urn:schemas-microsoft-com:office:word" xmlns:w="http://schemas.openxmlformats.org/wordprocessingml/2006/main" xmlns:w14="http://schemas.microsoft.com/office/word/2010/wordml" xmlns:wpg="http://schemas.microsoft.com/office/word/2010/wordprocessingGroup" xmlns:wpi="http://schemas.microsoft.com/office/word/2010/wordprocessingInk" xmlns:wne="http://schemas.microsoft.com/office/word/2006/wordml" xmlns:wps="http://schemas.microsoft.com/office/word/2010/wordprocessingShape" mc:Ignorable="w14 wp14">
   <w:body>
+    <w:p>
+      <w:pPr>
+        <w:jc w:val="center"/>
+      </w:pPr>
+      <w:r>
+        <w:drawing>
+          <wp:inline xmlns:a="http://schemas.openxmlformats.org/drawingml/2006/main" xmlns:pic="http://schemas.openxmlformats.org/drawingml/2006/picture">
+            <wp:extent cx="1097280" cy="1463040"/>
+            <wp:docPr id="1" name="Picture 1"/>
+            <wp:cNvGraphicFramePr>
+              <a:graphicFrameLocks noChangeAspect="1"/>
+            </wp:cNvGraphicFramePr>
+            <a:graphic>
+              <a:graphicData uri="http://schemas.openxmlformats.org/drawingml/2006/picture">
+                <pic:pic>
+                  <pic:nvPicPr>
+                    <pic:cNvPr id="0" name="nimisha_photo_resized.png"/>
+                    <pic:cNvPicPr/>
+                  </pic:nvPicPr>
+                  <pic:blipFill>
+                    <a:blip r:embed="rId9"/>
+                    <a:stretch>
+                      <a:fillRect/>
+                    </a:stretch>
+                  </pic:blipFill>
+                  <pic:spPr>
+                    <a:xfrm>
+                      <a:off x="0" y="0"/>
+                      <a:ext cx="1097280" cy="1463040"/>
+                    </a:xfrm>
+                    <a:prstGeom prst="rect"/>
+                  </pic:spPr>
+                </pic:pic>
+              </a:graphicData>
+            </a:graphic>
+          </wp:inline>
+        </w:drawing>
+      </w:r>
+    </w:p>
     <w:p>
       <w:pPr>
         <w:spacing w:after="40"/>

</xml_diff>

<commit_message>
Sync role responsibilities across pages and simple resumes
Co-authored-by: Copilot App <223556219+Copilot@users.noreply.github.com>
</commit_message>
<xml_diff>
--- a/Nimisha-Mehta-ATS-Resume-Visual.docx
+++ b/Nimisha-Mehta-ATS-Resume-Visual.docx
@@ -428,7 +428,7 @@
         <w:ind w:left="288"/>
       </w:pPr>
       <w:r>
-        <w:t>Lead Azure and AWS operations/engineering teams and drive end-to-end service delivery for enterprise cloud platforms.</w:t>
+        <w:t>Led end-to-end public cloud operations across AWS and Azure for enterprise clients in Pharma domain</w:t>
       </w:r>
     </w:p>
     <w:p>
@@ -438,7 +438,7 @@
         <w:ind w:left="288"/>
       </w:pPr>
       <w:r>
-        <w:t>Own operational governance with customers and stakeholders, including service reviews, KPI/SLA tracking, risk logs, and escalation management.</w:t>
+        <w:t>Owned operational governance: SLA/KPI tracking, service reviews, risk management, and escalation handling</w:t>
       </w:r>
     </w:p>
     <w:p>
@@ -448,7 +448,7 @@
         <w:ind w:left="288"/>
       </w:pPr>
       <w:r>
-        <w:t>Manage staffing and team productivity through capacity planning, shift coverage, prioritization, and skill-matrix-based allocation.</w:t>
+        <w:t>Utilizing Terraform based pipeline in Azure DevOps for operational efficiency.</w:t>
       </w:r>
     </w:p>
     <w:p>
@@ -458,7 +458,7 @@
         <w:ind w:left="288"/>
       </w:pPr>
       <w:r>
-        <w:t>Guide migration and modernization programs by aligning architecture, operations readiness, and cutover planning.</w:t>
+        <w:t>Established Splunk-based observability using Azure Event Hub and AWS CloudTrail for real-time alerting and incident detection</w:t>
       </w:r>
     </w:p>
     <w:p>
@@ -468,7 +468,7 @@
         <w:ind w:left="288"/>
       </w:pPr>
       <w:r>
-        <w:t>Drive cloud compliance and governance through tagging standards, policy enforcement, documentation standards, and operational controls.</w:t>
+        <w:t>Implemented AWS Instance Scheduler and Azure auto-shutdown policies for FinOps and cost reduction</w:t>
       </w:r>
     </w:p>
     <w:p>
@@ -478,7 +478,7 @@
         <w:ind w:left="288"/>
       </w:pPr>
       <w:r>
-        <w:t>Implement cloud cost optimization initiatives such as AWS Instance Scheduler, environment hygiene, and utilization tuning.</w:t>
+        <w:t>Built and maintained runbooks, SOPs, Design Specification documents and Work Instructions for operational resilience</w:t>
       </w:r>
     </w:p>
     <w:p>
@@ -488,7 +488,7 @@
         <w:ind w:left="288"/>
       </w:pPr>
       <w:r>
-        <w:t>Establish platform monitoring and alerting through Splunk integrations using Event Hub, Log Analytics, and CloudTrail.</w:t>
+        <w:t>Led vRealize Automation (vRA) and vRealize Orchestrator (vRO) implementation to automate manual cloud &amp; on-prem provisioning and operational tasks, eliminating repetitive human effort and reducing turnaround time</w:t>
       </w:r>
     </w:p>
     <w:p>
@@ -498,7 +498,7 @@
         <w:ind w:left="288"/>
       </w:pPr>
       <w:r>
-        <w:t>Enable secure cloud networking using Private Endpoints, ExpressRoute, Palo Alto firewall controls, Route53, and traffic-forwarding patterns.</w:t>
+        <w:t>Managed and maintained a library of 20+ vRO workflows covering VM lifecycle, DNS updates, storage provisioning, snapshot management, and IP Management.</w:t>
       </w:r>
     </w:p>
     <w:p>
@@ -508,7 +508,87 @@
         <w:ind w:left="288"/>
       </w:pPr>
       <w:r>
-        <w:t>Coach engineers and leads through regular feedback, mentorship, and growth planning to build a high-performing delivery culture.</w:t>
+        <w:t>Led operations team in adopting vRA self-service portal(Aria), and letting them leveraged by other teams as well.</w:t>
+      </w:r>
+    </w:p>
+    <w:p>
+      <w:pPr>
+        <w:pStyle w:val="ListBullet"/>
+      </w:pPr>
+      <w:r>
+        <w:t>Coordinated workflow governance: versioning, testing, peer review, and approval processes for all vRO workflow changes in production</w:t>
+      </w:r>
+    </w:p>
+    <w:p>
+      <w:pPr>
+        <w:pStyle w:val="ListBullet"/>
+      </w:pPr>
+      <w:r>
+        <w:t>Conducted formal qualification of cloud services before onboarding - assessed architecture design, security posture, resource tagging standards, naming conventions, and compliance alignment to ensure workloads met enterprise cloud readiness criteria</w:t>
+      </w:r>
+    </w:p>
+    <w:p>
+      <w:pPr>
+        <w:pStyle w:val="ListBullet"/>
+      </w:pPr>
+      <w:r>
+        <w:t>Maintained rigorous SLA tracking for all ServiceNow incident and service request tickets; produced weekly and monthly highlight reports covering open/closed ticket volumes, SLA breach analysis, incident trends, MTTR metrics, and actionable recommendations shared with customer and management stakeholders</w:t>
+      </w:r>
+    </w:p>
+    <w:p>
+      <w:pPr>
+        <w:pStyle w:val="ListBullet"/>
+      </w:pPr>
+      <w:r>
+        <w:t>Provided 24x7 on-call support for Priority 1 (P1) and critical incidents; led bridge calls, performed structured root cause analysis (RCA), coordinated with resolver teams, and ensured timely stakeholder communication and post-incident review documentation</w:t>
+      </w:r>
+    </w:p>
+    <w:p>
+      <w:pPr>
+        <w:pStyle w:val="ListBullet"/>
+      </w:pPr>
+      <w:r>
+        <w:t>Administered key cloud services across Azure and AWS including Virtual Networks (VNet), Virtual Machines, automated cloud provisioning pipelines, landing zone governance, private endpoints, DNS zones, App Services and storage account configurations</w:t>
+      </w:r>
+    </w:p>
+    <w:p>
+      <w:pPr>
+        <w:pStyle w:val="ListBullet"/>
+      </w:pPr>
+      <w:r>
+        <w:t>Led periodic orphan resource cleanup across Azure and AWS environments - identified and safely decommissioned unused virtual machines, unattached disks, stale snapshots, idle public IPs, and empty resource groups, delivering measurable cost savings and reducing environment clutter</w:t>
+      </w:r>
+    </w:p>
+    <w:p>
+      <w:pPr>
+        <w:pStyle w:val="ListBullet"/>
+      </w:pPr>
+      <w:r>
+        <w:t>Enforced cloud governance through Azure Policy assignments, AWS Service Control Policies (SCPs), RBAC-based access management, and Entra ID (Azure AD) lifecycle management including role assignments, Privileged Identity Management (PIM), group policies, and conditional access configurations</w:t>
+      </w:r>
+    </w:p>
+    <w:p>
+      <w:pPr>
+        <w:pStyle w:val="ListBullet"/>
+      </w:pPr>
+      <w:r>
+        <w:t>Managed cloud network operations including VNet peering, Hub-Spoke topology governance, ExpressRoute and VPN connectivity validation, NSG rule review cycles, and traffic routing configuration changes with full change management compliance</w:t>
+      </w:r>
+    </w:p>
+    <w:p>
+      <w:pPr>
+        <w:pStyle w:val="ListBullet"/>
+      </w:pPr>
+      <w:r>
+        <w:t>Delivered end-to-end cloud operations management - spanning service request intake, infrastructure provisioning, configuration, monitoring, patching, compliance checks, incident resolution, Problem Management ensuring full lifecycle accountability for all cloud assets</w:t>
+      </w:r>
+    </w:p>
+    <w:p>
+      <w:pPr>
+        <w:pStyle w:val="ListBullet"/>
+      </w:pPr>
+      <w:r>
+        <w:t>Designed, built, and maintained ServiceNow service catalogue items for cloud provisioning requests and enabling ServiceNow Discovery for better governance and compliance.</w:t>
       </w:r>
     </w:p>
     <w:p>

</xml_diff>